<commit_message>
Footer centrado con separador dorado, Georgia font, link bold dorado
</commit_message>
<xml_diff>
--- a/media/CV_Greivin_Cordero_Solano_EN.docx
+++ b/media/CV_Greivin_Cordero_Solano_EN.docx
@@ -60,7 +60,7 @@
         <w:spacing w:after="120"/>
         <w:jc w:val="center"/>
       </w:pPr>
-      <w:hyperlink w:history="1" r:id="rIdp9lx1sleuz1g-cawboq39">
+      <w:hyperlink w:history="1" r:id="rIdvxscpt4mj4qrbgqn8ik6q">
         <w:r>
           <w:rPr>
             <w:color w:val="6FB1FC"/>
@@ -79,7 +79,7 @@
         </w:rPr>
         <w:t xml:space="preserve">  |  </w:t>
       </w:r>
-      <w:hyperlink w:history="1" r:id="rId3f_eoqny-xzzlxpho7yrk">
+      <w:hyperlink w:history="1" r:id="rIddsshb0lwwiijwepnjsh0_">
         <w:r>
           <w:rPr>
             <w:color w:val="6FB1FC"/>
@@ -886,38 +886,65 @@
     </w:p>
     <w:p>
       <w:pPr>
-        <w:spacing w:after="12" w:before="100"/>
-      </w:pPr>
-      <w:r>
-        <w:rPr>
-          <w:b/>
-          <w:bCs/>
+        <w:spacing w:after="20" w:before="120"/>
+        <w:jc w:val="center"/>
+      </w:pPr>
+      <w:r>
+        <w:rPr>
           <w:color w:val="C9A85B"/>
-          <w:sz w:val="17"/>
-          <w:szCs w:val="17"/>
+          <w:sz w:val="28"/>
+          <w:szCs w:val="28"/>
+        </w:rPr>
+        <w:t xml:space="preserve">—</w:t>
+      </w:r>
+    </w:p>
+    <w:p>
+      <w:pPr>
+        <w:spacing w:after="15"/>
+        <w:jc w:val="center"/>
+      </w:pPr>
+      <w:r>
+        <w:rPr>
+          <w:rFonts w:ascii="Georgia" w:cs="Georgia" w:eastAsia="Georgia" w:hAnsi="Georgia"/>
+          <w:b/>
+          <w:bCs/>
+          <w:color w:val="C9A85B"/>
+          <w:sz w:val="20"/>
+          <w:szCs w:val="20"/>
         </w:rPr>
         <w:t xml:space="preserve">Supporting Documents</w:t>
       </w:r>
     </w:p>
     <w:p>
-      <w:r>
-        <w:rPr>
+      <w:pPr>
+        <w:spacing w:after="10"/>
+        <w:jc w:val="center"/>
+      </w:pPr>
+      <w:r>
+        <w:rPr>
+          <w:rFonts w:ascii="Georgia" w:cs="Georgia" w:eastAsia="Georgia" w:hAnsi="Georgia"/>
           <w:i/>
           <w:iCs/>
           <w:color w:val="555555"/>
           <w:sz w:val="16"/>
           <w:szCs w:val="16"/>
         </w:rPr>
-        <w:t xml:space="preserve">Recommendation letters, certificates, diplomas, and additional documents available at </w:t>
-      </w:r>
-      <w:hyperlink w:history="1" r:id="rIdaabf4ifwtm0ucwaetsg3b">
+        <w:t xml:space="preserve">Recommendation letters, certificates, diplomas, and additional documents available at</w:t>
+      </w:r>
+    </w:p>
+    <w:p>
+      <w:pPr>
+        <w:jc w:val="center"/>
+      </w:pPr>
+      <w:hyperlink w:history="1" r:id="rIdmscv_hitrlasswp80jcue">
         <w:r>
           <w:rPr>
+            <w:rFonts w:ascii="Georgia" w:cs="Georgia" w:eastAsia="Georgia" w:hAnsi="Georgia"/>
             <w:b/>
             <w:bCs/>
             <w:color w:val="C9A85B"/>
-            <w:sz w:val="17"/>
-            <w:szCs w:val="17"/>
+            <w:sz w:val="20"/>
+            <w:szCs w:val="20"/>
             <w:u w:val="single"/>
           </w:rPr>
           <w:t xml:space="preserve">maucordero.github.io/portfolio</w:t>

</xml_diff>

<commit_message>
Links por idioma: ES->?lang=es, EN->?lang=en. Portafolio auto-detecta parametro.
</commit_message>
<xml_diff>
--- a/media/CV_Greivin_Cordero_Solano_EN.docx
+++ b/media/CV_Greivin_Cordero_Solano_EN.docx
@@ -60,7 +60,7 @@
         <w:spacing w:after="120"/>
         <w:jc w:val="center"/>
       </w:pPr>
-      <w:hyperlink w:history="1" r:id="rIdvxscpt4mj4qrbgqn8ik6q">
+      <w:hyperlink w:history="1" r:id="rIdejcw8rydtv3pjwtzc2jlw">
         <w:r>
           <w:rPr>
             <w:color w:val="6FB1FC"/>
@@ -79,7 +79,7 @@
         </w:rPr>
         <w:t xml:space="preserve">  |  </w:t>
       </w:r>
-      <w:hyperlink w:history="1" r:id="rIddsshb0lwwiijwepnjsh0_">
+      <w:hyperlink w:history="1" r:id="rIdliecn_23x-75m9kbsygqe">
         <w:r>
           <w:rPr>
             <w:color w:val="6FB1FC"/>
@@ -936,7 +936,7 @@
       <w:pPr>
         <w:jc w:val="center"/>
       </w:pPr>
-      <w:hyperlink w:history="1" r:id="rIdmscv_hitrlasswp80jcue">
+      <w:hyperlink w:history="1" r:id="rIdfjyhrgpgy4-5vxfr2vezj">
         <w:r>
           <w:rPr>
             <w:rFonts w:ascii="Georgia" w:cs="Georgia" w:eastAsia="Georgia" w:hAnsi="Georgia"/>

</xml_diff>

<commit_message>
Update downloadable CVs: new profile, core skills, gold highlights, matching portfolio
</commit_message>
<xml_diff>
--- a/media/CV_Greivin_Cordero_Solano_EN.docx
+++ b/media/CV_Greivin_Cordero_Solano_EN.docx
@@ -29,11 +29,11 @@
         <w:rPr>
           <w:i/>
           <w:iCs/>
-          <w:color w:val="C9A85B"/>
+          <w:color w:val="B8953D"/>
           <w:sz w:val="18"/>
           <w:szCs w:val="18"/>
         </w:rPr>
-        <w:t xml:space="preserve">Hospitality Operations | Sales &amp; Customer Service Support | Digital Marketing</w:t>
+        <w:t>Bilingual Administrative &amp; Customer Service | Real Estate Support | Hospitality Operations</w:t>
       </w:r>
     </w:p>
     <w:p>
@@ -110,15 +110,20 @@
       </w:r>
     </w:p>
     <w:p>
-      <w:pPr>
-        <w:spacing w:after="30"/>
-      </w:pPr>
-      <w:r>
-        <w:rPr>
-          <w:sz w:val="17"/>
-          <w:szCs w:val="17"/>
-        </w:rPr>
-        <w:t xml:space="preserve">Hospitality Professional and F&amp;B Manager with expertise in cost control, advanced Excel automation, and digital marketing. Completed the Diploma in Sustainable Tourism Management at UNED; currently pursuing the Bachelor's degree. I combine analytical thinking with operational execution to transform data into business decisions.</w:t>
+      <w:r>
+        <w:rPr>
+          <w:rFonts w:ascii="Arial" w:hAnsi="Arial"/>
+          <w:b w:val="0"/>
+          <w:color w:val="000000"/>
+          <w:sz w:val="22"/>
+        </w:rPr>
+        <w:t>Bilingual Administrative and Customer Service Professional with a solid background in real estate operations, hospitality, and international team support. Having spent over three years successfully supporting an overseas company in a fully remote capacity, I know what it takes to deliver reliable results across different time zones. I am comfortable managing asynchronous communication, organizing digital workspaces, and ensuring daily administrative tasks are completed efficiently without needing constant supervision. I have also translated my strong foundation in client relations into the real estate sector. My focus is on operational accuracy: maintaining precise client records, executing reliable data entry within database systems, handling bilingual customer inquiries, and assisting the sales workflow to keep the team organized and responsive.</w:t>
+        <w:br/>
+        <w:br/>
+        <w:t>Currently, I am pursuing a Bachelor's degree in Sustainable Tourism Management at UNED. This academic environment has further strengthened my discipline for independent work, research, and long-term project planning.</w:t>
+        <w:br/>
+        <w:br/>
+        <w:t>To bridge the gap between traditional operations and modern digital efficiency, I am actively expanding my technical toolkit. I am dedicating time to learning data analysis fundamentals and intermediate Excel, with the goal of eventually helping teams optimize administrative processes and elevate the overall client experience.</w:t>
       </w:r>
     </w:p>
     <w:p>
@@ -136,113 +141,102 @@
           <w:sz w:val="22"/>
           <w:szCs w:val="22"/>
         </w:rPr>
-        <w:t xml:space="preserve">Core Competencies</w:t>
-      </w:r>
-    </w:p>
-    <w:p>
-      <w:pPr>
-        <w:spacing w:after="10"/>
-      </w:pPr>
-      <w:r>
-        <w:rPr>
-          <w:b/>
-          <w:bCs/>
-          <w:color w:val="1F3A5F"/>
-          <w:sz w:val="16"/>
-          <w:szCs w:val="16"/>
-        </w:rPr>
-        <w:t xml:space="preserve">Operations: </w:t>
-      </w:r>
-      <w:r>
-        <w:rPr>
-          <w:sz w:val="16"/>
-          <w:szCs w:val="16"/>
-        </w:rPr>
-        <w:t xml:space="preserve">F&amp;B Management, Supply Chain &amp; Procurement, Service Standards, Guest Relations</w:t>
-      </w:r>
-    </w:p>
-    <w:p>
-      <w:pPr>
-        <w:spacing w:after="10"/>
-      </w:pPr>
-      <w:r>
-        <w:rPr>
-          <w:b/>
-          <w:bCs/>
-          <w:color w:val="1F3A5F"/>
-          <w:sz w:val="16"/>
-          <w:szCs w:val="16"/>
-        </w:rPr>
-        <w:t xml:space="preserve">Reporting &amp; KPIs: </w:t>
-      </w:r>
-      <w:r>
-        <w:rPr>
-          <w:sz w:val="16"/>
-          <w:szCs w:val="16"/>
-        </w:rPr>
-        <w:t xml:space="preserve">Advanced Excel, KPI Reporting, Cost Optimization, Operational Tracking</w:t>
-      </w:r>
-    </w:p>
-    <w:p>
-      <w:pPr>
-        <w:spacing w:after="10"/>
-      </w:pPr>
-      <w:r>
-        <w:rPr>
-          <w:b/>
-          <w:bCs/>
-          <w:color w:val="1F3A5F"/>
-          <w:sz w:val="16"/>
-          <w:szCs w:val="16"/>
-        </w:rPr>
-        <w:t xml:space="preserve">Sales &amp; CRM: </w:t>
-      </w:r>
-      <w:r>
-        <w:rPr>
-          <w:sz w:val="16"/>
-          <w:szCs w:val="16"/>
-        </w:rPr>
-        <w:t xml:space="preserve">Sales Support, Lead Tracking, Bilingual Client Relations, CRM Management</w:t>
-      </w:r>
-    </w:p>
-    <w:p>
-      <w:pPr>
-        <w:spacing w:after="10"/>
-      </w:pPr>
-      <w:r>
-        <w:rPr>
-          <w:b/>
-          <w:bCs/>
-          <w:color w:val="1F3A5F"/>
-          <w:sz w:val="16"/>
-          <w:szCs w:val="16"/>
-        </w:rPr>
-        <w:t xml:space="preserve">Digital: </w:t>
-      </w:r>
-      <w:r>
-        <w:rPr>
-          <w:sz w:val="16"/>
-          <w:szCs w:val="16"/>
-        </w:rPr>
-        <w:t xml:space="preserve">Digital Marketing Strategy, Social Media Management, Canva Design</w:t>
-      </w:r>
-    </w:p>
-    <w:p>
-      <w:pPr>
-        <w:pBdr>
-          <w:bottom w:val="single" w:color="C9A85B" w:sz="6"/>
-        </w:pBdr>
-        <w:spacing w:after="40" w:before="120"/>
-      </w:pPr>
-      <w:r>
-        <w:rPr>
-          <w:b/>
-          <w:bCs/>
-          <w:color w:val="1F3A5F"/>
+        <w:t>Core Skills &amp; Daily Experience</w:t>
+      </w:r>
+    </w:p>
+    <w:p>
+      <w:r>
+        <w:rPr>
+          <w:rFonts w:ascii="Arial" w:hAnsi="Arial"/>
+          <w:b/>
+          <w:color w:val="1A3A4A"/>
           <w:sz w:val="22"/>
-          <w:szCs w:val="22"/>
-        </w:rPr>
-        <w:t xml:space="preserve">Work Experience</w:t>
+        </w:rPr>
+        <w:t xml:space="preserve">Administrative Operations: </w:t>
+      </w:r>
+      <w:r>
+        <w:rPr>
+          <w:rFonts w:ascii="Arial" w:hAnsi="Arial"/>
+          <w:color w:val="000000"/>
+          <w:sz w:val="22"/>
+        </w:rPr>
+        <w:t>Data entry, digital document organization, email management, and reliable cross-timezone communication.</w:t>
+      </w:r>
+    </w:p>
+    <w:p>
+      <w:r>
+        <w:rPr>
+          <w:rFonts w:ascii="Arial" w:hAnsi="Arial"/>
+          <w:b/>
+          <w:color w:val="1A3A4A"/>
+          <w:sz w:val="22"/>
+        </w:rPr>
+        <w:t xml:space="preserve">Customer Service: </w:t>
+      </w:r>
+      <w:r>
+        <w:rPr>
+          <w:rFonts w:ascii="Arial" w:hAnsi="Arial"/>
+          <w:color w:val="000000"/>
+          <w:sz w:val="22"/>
+        </w:rPr>
+        <w:t>Bilingual support (English/Spanish), answering client inquiries, and resolving daily operational issues with a positive attitude.</w:t>
+      </w:r>
+    </w:p>
+    <w:p>
+      <w:r>
+        <w:rPr>
+          <w:rFonts w:ascii="Arial" w:hAnsi="Arial"/>
+          <w:b/>
+          <w:color w:val="1A3A4A"/>
+          <w:sz w:val="22"/>
+        </w:rPr>
+        <w:t xml:space="preserve">Real Estate Support: </w:t>
+      </w:r>
+      <w:r>
+        <w:rPr>
+          <w:rFonts w:ascii="Arial" w:hAnsi="Arial"/>
+          <w:color w:val="000000"/>
+          <w:sz w:val="22"/>
+        </w:rPr>
+        <w:t>Updating property databases, assisting with daily office tasks, and supporting the sales team's workflow.</w:t>
+      </w:r>
+    </w:p>
+    <w:p>
+      <w:r>
+        <w:rPr>
+          <w:rFonts w:ascii="Arial" w:hAnsi="Arial"/>
+          <w:b/>
+          <w:color w:val="1A3A4A"/>
+          <w:sz w:val="22"/>
+        </w:rPr>
+        <w:t xml:space="preserve">Hospitality Operations: </w:t>
+      </w:r>
+      <w:r>
+        <w:rPr>
+          <w:rFonts w:ascii="Arial" w:hAnsi="Arial"/>
+          <w:color w:val="000000"/>
+          <w:sz w:val="22"/>
+        </w:rPr>
+        <w:t>High-volume customer service, order management, and ensuring excellent guest experiences in dynamic environments.</w:t>
+      </w:r>
+    </w:p>
+    <w:p>
+      <w:r>
+        <w:rPr>
+          <w:rFonts w:ascii="Arial" w:hAnsi="Arial"/>
+          <w:b/>
+          <w:color w:val="1A3A4A"/>
+          <w:sz w:val="22"/>
+        </w:rPr>
+        <w:t xml:space="preserve">Autonomous Work &amp; Learning: </w:t>
+      </w:r>
+      <w:r>
+        <w:rPr>
+          <w:rFonts w:ascii="Arial" w:hAnsi="Arial"/>
+          <w:color w:val="000000"/>
+          <w:sz w:val="22"/>
+        </w:rPr>
+        <w:t>Proven ability to work independently, manage time effectively, and actively learn new tools like basic Excel and data analysis.</w:t>
       </w:r>
     </w:p>
     <w:p>
@@ -260,7 +254,7 @@
           <w:sz w:val="17"/>
           <w:szCs w:val="17"/>
         </w:rPr>
-        <w:t xml:space="preserve">Hospitality Operations | Sales &amp; Customer Service Support | Digital Marketing</w:t>
+        <w:t>Hospitality Operations | Sales &amp; Customer Service Support | Digital Tools &amp; Marketing</w:t>
       </w:r>
       <w:r>
         <w:rPr>
@@ -437,7 +431,7 @@
           <w:sz w:val="17"/>
           <w:szCs w:val="17"/>
         </w:rPr>
-        <w:t xml:space="preserve">Hospitality &amp; Operations Experience</w:t>
+        <w:t>Service Operations &amp; Guest Experience</w:t>
       </w:r>
       <w:r>
         <w:rPr>
@@ -588,7 +582,7 @@
           <w:sz w:val="17"/>
           <w:szCs w:val="17"/>
         </w:rPr>
-        <w:t xml:space="preserve">Administrative Assistant &amp; Intl. Customer Service Specialist</w:t>
+        <w:t>Administrative Assistant &amp; International Customer Service Specialist</w:t>
       </w:r>
       <w:r>
         <w:rPr>

</xml_diff>

<commit_message>
Update CVs: new profile, 5 core skills, gold highlights, 1-page preserved
</commit_message>
<xml_diff>
--- a/media/CV_Greivin_Cordero_Solano_EN.docx
+++ b/media/CV_Greivin_Cordero_Solano_EN.docx
@@ -28,10 +28,8 @@
       <w:r>
         <w:rPr>
           <w:i/>
-          <w:iCs/>
           <w:color w:val="B8953D"/>
           <w:sz w:val="18"/>
-          <w:szCs w:val="18"/>
         </w:rPr>
         <w:t>Bilingual Administrative &amp; Customer Service | Real Estate Support | Hospitality Operations</w:t>
       </w:r>
@@ -110,20 +108,99 @@
       </w:r>
     </w:p>
     <w:p>
-      <w:r>
-        <w:rPr>
-          <w:rFonts w:ascii="Arial" w:hAnsi="Arial"/>
-          <w:b w:val="0"/>
-          <w:color w:val="000000"/>
-          <w:sz w:val="22"/>
-        </w:rPr>
-        <w:t>Bilingual Administrative and Customer Service Professional with a solid background in real estate operations, hospitality, and international team support. Having spent over three years successfully supporting an overseas company in a fully remote capacity, I know what it takes to deliver reliable results across different time zones. I am comfortable managing asynchronous communication, organizing digital workspaces, and ensuring daily administrative tasks are completed efficiently without needing constant supervision. I have also translated my strong foundation in client relations into the real estate sector. My focus is on operational accuracy: maintaining precise client records, executing reliable data entry within database systems, handling bilingual customer inquiries, and assisting the sales workflow to keep the team organized and responsive.</w:t>
-        <w:br/>
-        <w:br/>
-        <w:t>Currently, I am pursuing a Bachelor's degree in Sustainable Tourism Management at UNED. This academic environment has further strengthened my discipline for independent work, research, and long-term project planning.</w:t>
-        <w:br/>
-        <w:br/>
-        <w:t>To bridge the gap between traditional operations and modern digital efficiency, I am actively expanding my technical toolkit. I am dedicating time to learning data analysis fundamentals and intermediate Excel, with the goal of eventually helping teams optimize administrative processes and elevate the overall client experience.</w:t>
+      <w:pPr>
+        <w:spacing w:after="30"/>
+      </w:pPr>
+      <w:r>
+        <w:rPr>
+          <w:color w:val="B8953D"/>
+          <w:sz w:val="17"/>
+        </w:rPr>
+        <w:t>Bilingual Administrative and Customer Service Professional</w:t>
+      </w:r>
+      <w:r>
+        <w:rPr>
+          <w:sz w:val="17"/>
+        </w:rPr>
+        <w:t xml:space="preserve"> with a solid background in </w:t>
+      </w:r>
+      <w:r>
+        <w:rPr>
+          <w:color w:val="B8953D"/>
+          <w:sz w:val="17"/>
+        </w:rPr>
+        <w:t>real estate operations</w:t>
+      </w:r>
+      <w:r>
+        <w:rPr>
+          <w:sz w:val="17"/>
+        </w:rPr>
+        <w:t xml:space="preserve">, hospitality, and </w:t>
+      </w:r>
+      <w:r>
+        <w:rPr>
+          <w:color w:val="B8953D"/>
+          <w:sz w:val="17"/>
+        </w:rPr>
+        <w:t>international team support</w:t>
+      </w:r>
+      <w:r>
+        <w:rPr>
+          <w:sz w:val="17"/>
+        </w:rPr>
+        <w:t xml:space="preserve">. Over three years of remote experience supporting an overseas company across time zones. Skilled in </w:t>
+      </w:r>
+      <w:r>
+        <w:rPr>
+          <w:color w:val="B8953D"/>
+          <w:sz w:val="17"/>
+        </w:rPr>
+        <w:t>asynchronous communication</w:t>
+      </w:r>
+      <w:r>
+        <w:rPr>
+          <w:sz w:val="17"/>
+        </w:rPr>
+        <w:t xml:space="preserve">, digital workspace organization, and independent task management. Strong foundation in client relations applied to real estate: precise client records, database data entry, </w:t>
+      </w:r>
+      <w:r>
+        <w:rPr>
+          <w:color w:val="B8953D"/>
+          <w:sz w:val="17"/>
+        </w:rPr>
+        <w:t>bilingual customer inquiries</w:t>
+      </w:r>
+      <w:r>
+        <w:rPr>
+          <w:sz w:val="17"/>
+        </w:rPr>
+        <w:t xml:space="preserve">, and sales workflow support. Currently pursuing a Bachelor's in Sustainable Tourism Management at UNED. Actively learning </w:t>
+      </w:r>
+      <w:r>
+        <w:rPr>
+          <w:color w:val="B8953D"/>
+          <w:sz w:val="17"/>
+        </w:rPr>
+        <w:t>data analysis fundamentals</w:t>
+      </w:r>
+      <w:r>
+        <w:rPr>
+          <w:sz w:val="17"/>
+        </w:rPr>
+        <w:t xml:space="preserve"> and </w:t>
+      </w:r>
+      <w:r>
+        <w:rPr>
+          <w:color w:val="B8953D"/>
+          <w:sz w:val="17"/>
+        </w:rPr>
+        <w:t>intermediate Excel</w:t>
+      </w:r>
+      <w:r>
+        <w:rPr>
+          <w:sz w:val="17"/>
+        </w:rPr>
+        <w:t>.</w:t>
       </w:r>
     </w:p>
     <w:p>
@@ -141,102 +218,112 @@
           <w:sz w:val="22"/>
           <w:szCs w:val="22"/>
         </w:rPr>
-        <w:t>Core Skills &amp; Daily Experience</w:t>
-      </w:r>
-    </w:p>
-    <w:p>
-      <w:r>
-        <w:rPr>
-          <w:rFonts w:ascii="Arial" w:hAnsi="Arial"/>
-          <w:b/>
-          <w:color w:val="1A3A4A"/>
+        <w:t xml:space="preserve">Core Competencies</w:t>
+      </w:r>
+    </w:p>
+    <w:p>
+      <w:pPr>
+        <w:spacing w:after="10"/>
+      </w:pPr>
+      <w:r>
+        <w:rPr>
+          <w:b/>
+          <w:bCs/>
+          <w:color w:val="1F3A5F"/>
+          <w:sz w:val="16"/>
+          <w:szCs w:val="16"/>
+        </w:rPr>
+        <w:t>Administrative Operations: Data entry, digital document organization, email management, and reliable cross-timezone communication.</w:t>
+      </w:r>
+    </w:p>
+    <w:p>
+      <w:pPr>
+        <w:spacing w:after="10"/>
+      </w:pPr>
+      <w:r>
+        <w:rPr>
+          <w:b/>
+          <w:bCs/>
+          <w:color w:val="1F3A5F"/>
+          <w:sz w:val="16"/>
+          <w:szCs w:val="16"/>
+        </w:rPr>
+        <w:t>Customer Service: Bilingual support (English/Spanish), answering client inquiries, and resolving daily operational issues with a positive attitude.</w:t>
+      </w:r>
+    </w:p>
+    <w:p>
+      <w:pPr>
+        <w:spacing w:after="10"/>
+      </w:pPr>
+      <w:r>
+        <w:rPr>
+          <w:b/>
+          <w:color w:val="B8953D"/>
+          <w:sz w:val="16"/>
+        </w:rPr>
+        <w:t>Real Estate Support</w:t>
+      </w:r>
+      <w:r>
+        <w:rPr>
+          <w:b/>
+          <w:sz w:val="16"/>
+        </w:rPr>
+        <w:t>: Updating property databases, assisting with daily office tasks, and supporting the sales team's workflow.</w:t>
+      </w:r>
+    </w:p>
+    <w:p>
+      <w:pPr>
+        <w:spacing w:after="10"/>
+      </w:pPr>
+      <w:r>
+        <w:rPr>
+          <w:b/>
+          <w:color w:val="B8953D"/>
+          <w:sz w:val="16"/>
+        </w:rPr>
+        <w:t>Hospitality Operations</w:t>
+      </w:r>
+      <w:r>
+        <w:rPr>
+          <w:b/>
+          <w:sz w:val="16"/>
+        </w:rPr>
+        <w:t>: High-volume customer service, order management, and ensuring excellent guest experiences in dynamic environments.</w:t>
+      </w:r>
+    </w:p>
+    <w:p>
+      <w:r>
+        <w:rPr>
+          <w:b/>
+          <w:color w:val="B8953D"/>
+          <w:sz w:val="16"/>
+        </w:rPr>
+        <w:t>Autonomous Work &amp; Learning</w:t>
+      </w:r>
+      <w:r>
+        <w:rPr>
+          <w:b/>
+          <w:sz w:val="16"/>
+        </w:rPr>
+        <w:t>: Proven ability to work independently, manage time effectively, and actively learn new tools like basic Excel and data analysis.</w:t>
+      </w:r>
+    </w:p>
+    <w:p>
+      <w:pPr>
+        <w:pBdr>
+          <w:bottom w:val="single" w:color="C9A85B" w:sz="6"/>
+        </w:pBdr>
+        <w:spacing w:after="40" w:before="120"/>
+      </w:pPr>
+      <w:r>
+        <w:rPr>
+          <w:b/>
+          <w:bCs/>
+          <w:color w:val="1F3A5F"/>
           <w:sz w:val="22"/>
-        </w:rPr>
-        <w:t xml:space="preserve">Administrative Operations: </w:t>
-      </w:r>
-      <w:r>
-        <w:rPr>
-          <w:rFonts w:ascii="Arial" w:hAnsi="Arial"/>
-          <w:color w:val="000000"/>
-          <w:sz w:val="22"/>
-        </w:rPr>
-        <w:t>Data entry, digital document organization, email management, and reliable cross-timezone communication.</w:t>
-      </w:r>
-    </w:p>
-    <w:p>
-      <w:r>
-        <w:rPr>
-          <w:rFonts w:ascii="Arial" w:hAnsi="Arial"/>
-          <w:b/>
-          <w:color w:val="1A3A4A"/>
-          <w:sz w:val="22"/>
-        </w:rPr>
-        <w:t xml:space="preserve">Customer Service: </w:t>
-      </w:r>
-      <w:r>
-        <w:rPr>
-          <w:rFonts w:ascii="Arial" w:hAnsi="Arial"/>
-          <w:color w:val="000000"/>
-          <w:sz w:val="22"/>
-        </w:rPr>
-        <w:t>Bilingual support (English/Spanish), answering client inquiries, and resolving daily operational issues with a positive attitude.</w:t>
-      </w:r>
-    </w:p>
-    <w:p>
-      <w:r>
-        <w:rPr>
-          <w:rFonts w:ascii="Arial" w:hAnsi="Arial"/>
-          <w:b/>
-          <w:color w:val="1A3A4A"/>
-          <w:sz w:val="22"/>
-        </w:rPr>
-        <w:t xml:space="preserve">Real Estate Support: </w:t>
-      </w:r>
-      <w:r>
-        <w:rPr>
-          <w:rFonts w:ascii="Arial" w:hAnsi="Arial"/>
-          <w:color w:val="000000"/>
-          <w:sz w:val="22"/>
-        </w:rPr>
-        <w:t>Updating property databases, assisting with daily office tasks, and supporting the sales team's workflow.</w:t>
-      </w:r>
-    </w:p>
-    <w:p>
-      <w:r>
-        <w:rPr>
-          <w:rFonts w:ascii="Arial" w:hAnsi="Arial"/>
-          <w:b/>
-          <w:color w:val="1A3A4A"/>
-          <w:sz w:val="22"/>
-        </w:rPr>
-        <w:t xml:space="preserve">Hospitality Operations: </w:t>
-      </w:r>
-      <w:r>
-        <w:rPr>
-          <w:rFonts w:ascii="Arial" w:hAnsi="Arial"/>
-          <w:color w:val="000000"/>
-          <w:sz w:val="22"/>
-        </w:rPr>
-        <w:t>High-volume customer service, order management, and ensuring excellent guest experiences in dynamic environments.</w:t>
-      </w:r>
-    </w:p>
-    <w:p>
-      <w:r>
-        <w:rPr>
-          <w:rFonts w:ascii="Arial" w:hAnsi="Arial"/>
-          <w:b/>
-          <w:color w:val="1A3A4A"/>
-          <w:sz w:val="22"/>
-        </w:rPr>
-        <w:t xml:space="preserve">Autonomous Work &amp; Learning: </w:t>
-      </w:r>
-      <w:r>
-        <w:rPr>
-          <w:rFonts w:ascii="Arial" w:hAnsi="Arial"/>
-          <w:color w:val="000000"/>
-          <w:sz w:val="22"/>
-        </w:rPr>
-        <w:t>Proven ability to work independently, manage time effectively, and actively learn new tools like basic Excel and data analysis.</w:t>
+          <w:szCs w:val="22"/>
+        </w:rPr>
+        <w:t xml:space="preserve">Work Experience</w:t>
       </w:r>
     </w:p>
     <w:p>
@@ -249,22 +336,19 @@
       <w:r>
         <w:rPr>
           <w:b/>
-          <w:bCs/>
-          <w:color w:val="1F3A5F"/>
-          <w:sz w:val="17"/>
-          <w:szCs w:val="17"/>
-        </w:rPr>
-        <w:t>Hospitality Operations | Sales &amp; Customer Service Support | Digital Tools &amp; Marketing</w:t>
-      </w:r>
-      <w:r>
-        <w:rPr>
-          <w:b/>
-          <w:bCs/>
-          <w:color w:val="C9A85B"/>
-          <w:sz w:val="15"/>
-          <w:szCs w:val="15"/>
-        </w:rPr>
-        <w:t xml:space="preserve">	Feb 2026 – Present</w:t>
+          <w:color w:val="B8953D"/>
+          <w:sz w:val="17"/>
+        </w:rPr>
+        <w:t>Hospitality Operations</w:t>
+      </w:r>
+      <w:r>
+        <w:rPr>
+          <w:b/>
+          <w:sz w:val="17"/>
+        </w:rPr>
+        <w:t xml:space="preserve"> | Sales &amp; Customer Service Support | Digital Marketing</w:t>
+        <w:tab/>
+        <w:t>Feb 2026 – Present</w:t>
       </w:r>
     </w:p>
     <w:p>
@@ -432,16 +516,8 @@
           <w:szCs w:val="17"/>
         </w:rPr>
         <w:t>Service Operations &amp; Guest Experience</w:t>
-      </w:r>
-      <w:r>
-        <w:rPr>
-          <w:b/>
-          <w:bCs/>
-          <w:color w:val="C9A85B"/>
-          <w:sz w:val="15"/>
-          <w:szCs w:val="15"/>
-        </w:rPr>
-        <w:t xml:space="preserve">	Aug 2021 – Nov 2025 · 4 yrs 4 months</w:t>
+        <w:tab/>
+        <w:t>Aug 2021 – Nov 2025 · 4 yrs 4 months</w:t>
       </w:r>
     </w:p>
     <w:p>
@@ -583,16 +659,8 @@
           <w:szCs w:val="17"/>
         </w:rPr>
         <w:t>Administrative Assistant &amp; International Customer Service Specialist</w:t>
-      </w:r>
-      <w:r>
-        <w:rPr>
-          <w:b/>
-          <w:bCs/>
-          <w:color w:val="C9A85B"/>
-          <w:sz w:val="15"/>
-          <w:szCs w:val="15"/>
-        </w:rPr>
-        <w:t xml:space="preserve">	Jan 2014 – Apr 2017 · 3 yrs 4 months</w:t>
+        <w:tab/>
+        <w:t>Jan 2014 – Apr 2017 · 3 yrs 4 months</w:t>
       </w:r>
     </w:p>
     <w:p>

</xml_diff>

<commit_message>
CVs: 1-page, compact profile, minimal gold, updated competencies
</commit_message>
<xml_diff>
--- a/media/CV_Greivin_Cordero_Solano_EN.docx
+++ b/media/CV_Greivin_Cordero_Solano_EN.docx
@@ -31,7 +31,14 @@
           <w:color w:val="B8953D"/>
           <w:sz w:val="18"/>
         </w:rPr>
-        <w:t>Bilingual Administrative &amp; Customer Service | Real Estate Support | Hospitality Operations</w:t>
+        <w:t>Bilingual Admin &amp; Customer Service</w:t>
+      </w:r>
+      <w:r>
+        <w:rPr>
+          <w:i/>
+          <w:sz w:val="18"/>
+        </w:rPr>
+        <w:t xml:space="preserve"> | Real Estate Support | Hospitality Operations</w:t>
       </w:r>
     </w:p>
     <w:p>
@@ -113,94 +120,10 @@
       </w:pPr>
       <w:r>
         <w:rPr>
-          <w:color w:val="B8953D"/>
           <w:sz w:val="17"/>
-        </w:rPr>
-        <w:t>Bilingual Administrative and Customer Service Professional</w:t>
-      </w:r>
-      <w:r>
-        <w:rPr>
-          <w:sz w:val="17"/>
-        </w:rPr>
-        <w:t xml:space="preserve"> with a solid background in </w:t>
-      </w:r>
-      <w:r>
-        <w:rPr>
-          <w:color w:val="B8953D"/>
-          <w:sz w:val="17"/>
-        </w:rPr>
-        <w:t>real estate operations</w:t>
-      </w:r>
-      <w:r>
-        <w:rPr>
-          <w:sz w:val="17"/>
-        </w:rPr>
-        <w:t xml:space="preserve">, hospitality, and </w:t>
-      </w:r>
-      <w:r>
-        <w:rPr>
-          <w:color w:val="B8953D"/>
-          <w:sz w:val="17"/>
-        </w:rPr>
-        <w:t>international team support</w:t>
-      </w:r>
-      <w:r>
-        <w:rPr>
-          <w:sz w:val="17"/>
-        </w:rPr>
-        <w:t xml:space="preserve">. Over three years of remote experience supporting an overseas company across time zones. Skilled in </w:t>
-      </w:r>
-      <w:r>
-        <w:rPr>
-          <w:color w:val="B8953D"/>
-          <w:sz w:val="17"/>
-        </w:rPr>
-        <w:t>asynchronous communication</w:t>
-      </w:r>
-      <w:r>
-        <w:rPr>
-          <w:sz w:val="17"/>
-        </w:rPr>
-        <w:t xml:space="preserve">, digital workspace organization, and independent task management. Strong foundation in client relations applied to real estate: precise client records, database data entry, </w:t>
-      </w:r>
-      <w:r>
-        <w:rPr>
-          <w:color w:val="B8953D"/>
-          <w:sz w:val="17"/>
-        </w:rPr>
-        <w:t>bilingual customer inquiries</w:t>
-      </w:r>
-      <w:r>
-        <w:rPr>
-          <w:sz w:val="17"/>
-        </w:rPr>
-        <w:t xml:space="preserve">, and sales workflow support. Currently pursuing a Bachelor's in Sustainable Tourism Management at UNED. Actively learning </w:t>
-      </w:r>
-      <w:r>
-        <w:rPr>
-          <w:color w:val="B8953D"/>
-          <w:sz w:val="17"/>
-        </w:rPr>
-        <w:t>data analysis fundamentals</w:t>
-      </w:r>
-      <w:r>
-        <w:rPr>
-          <w:sz w:val="17"/>
-        </w:rPr>
-        <w:t xml:space="preserve"> and </w:t>
-      </w:r>
-      <w:r>
-        <w:rPr>
-          <w:color w:val="B8953D"/>
-          <w:sz w:val="17"/>
-        </w:rPr>
-        <w:t>intermediate Excel</w:t>
-      </w:r>
-      <w:r>
-        <w:rPr>
-          <w:sz w:val="17"/>
-        </w:rPr>
-        <w:t>.</w:t>
+          <w:szCs w:val="17"/>
+        </w:rPr>
+        <w:t>Bilingual Administrative and Customer Service Professional with experience in real estate operations, hospitality, and international remote support. Skilled in asynchronous communication, digital organization, and independent task management. Background in client records, data entry, bilingual inquiries, and sales support. Pursuing a Bachelor's in Sustainable Tourism Management at UNED. Learning data analysis and intermediate Excel.</w:t>
       </w:r>
     </w:p>
     <w:p>
@@ -233,7 +156,7 @@
           <w:sz w:val="16"/>
           <w:szCs w:val="16"/>
         </w:rPr>
-        <w:t>Administrative Operations: Data entry, digital document organization, email management, and reliable cross-timezone communication.</w:t>
+        <w:t>Administrative Operations: Data entry, digital document organization, email management, and cross-timezone communication.</w:t>
       </w:r>
     </w:p>
     <w:p>
@@ -248,7 +171,7 @@
           <w:sz w:val="16"/>
           <w:szCs w:val="16"/>
         </w:rPr>
-        <w:t>Customer Service: Bilingual support (English/Spanish), answering client inquiries, and resolving daily operational issues with a positive attitude.</w:t>
+        <w:t>Customer Service: Bilingual support (English/Spanish), answering client inquiries, and resolving daily operational issues.</w:t>
       </w:r>
     </w:p>
     <w:p>
@@ -258,17 +181,12 @@
       <w:r>
         <w:rPr>
           <w:b/>
-          <w:color w:val="B8953D"/>
-          <w:sz w:val="16"/>
-        </w:rPr>
-        <w:t>Real Estate Support</w:t>
-      </w:r>
-      <w:r>
-        <w:rPr>
-          <w:b/>
-          <w:sz w:val="16"/>
-        </w:rPr>
-        <w:t>: Updating property databases, assisting with daily office tasks, and supporting the sales team's workflow.</w:t>
+          <w:bCs/>
+          <w:color w:val="1F3A5F"/>
+          <w:sz w:val="16"/>
+          <w:szCs w:val="16"/>
+        </w:rPr>
+        <w:t>Real Estate Support: Updating property databases, assisting with daily office tasks, and supporting sales workflow.</w:t>
       </w:r>
     </w:p>
     <w:p>
@@ -278,34 +196,12 @@
       <w:r>
         <w:rPr>
           <w:b/>
-          <w:color w:val="B8953D"/>
-          <w:sz w:val="16"/>
-        </w:rPr>
-        <w:t>Hospitality Operations</w:t>
-      </w:r>
-      <w:r>
-        <w:rPr>
-          <w:b/>
-          <w:sz w:val="16"/>
-        </w:rPr>
-        <w:t>: High-volume customer service, order management, and ensuring excellent guest experiences in dynamic environments.</w:t>
-      </w:r>
-    </w:p>
-    <w:p>
-      <w:r>
-        <w:rPr>
-          <w:b/>
-          <w:color w:val="B8953D"/>
-          <w:sz w:val="16"/>
-        </w:rPr>
-        <w:t>Autonomous Work &amp; Learning</w:t>
-      </w:r>
-      <w:r>
-        <w:rPr>
-          <w:b/>
-          <w:sz w:val="16"/>
-        </w:rPr>
-        <w:t>: Proven ability to work independently, manage time effectively, and actively learn new tools like basic Excel and data analysis.</w:t>
+          <w:bCs/>
+          <w:color w:val="1F3A5F"/>
+          <w:sz w:val="16"/>
+          <w:szCs w:val="16"/>
+        </w:rPr>
+        <w:t>Hospitality Operations: High-volume customer service, order management, and excellent guest experiences in dynamic environments.</w:t>
       </w:r>
     </w:p>
     <w:p>
@@ -339,16 +235,7 @@
           <w:color w:val="B8953D"/>
           <w:sz w:val="17"/>
         </w:rPr>
-        <w:t>Hospitality Operations</w:t>
-      </w:r>
-      <w:r>
-        <w:rPr>
-          <w:b/>
-          <w:sz w:val="17"/>
-        </w:rPr>
-        <w:t xml:space="preserve"> | Sales &amp; Customer Service Support | Digital Marketing</w:t>
-        <w:tab/>
-        <w:t>Feb 2026 – Present</w:t>
+        <w:t>Hospitality Operations | Sales &amp; Customer Service Support | Digital Tools &amp; Marketing</w:t>
       </w:r>
     </w:p>
     <w:p>

</xml_diff>

<commit_message>
Update headline to LinkedIn: Administrative & Operations Support | Client Relations | CRM Data Entry | Tourism & Real Estate
</commit_message>
<xml_diff>
--- a/media/CV_Greivin_Cordero_Solano_EN.docx
+++ b/media/CV_Greivin_Cordero_Solano_EN.docx
@@ -31,14 +31,7 @@
           <w:color w:val="B8953D"/>
           <w:sz w:val="18"/>
         </w:rPr>
-        <w:t>Bilingual Admin &amp; Customer Service</w:t>
-      </w:r>
-      <w:r>
-        <w:rPr>
-          <w:i/>
-          <w:sz w:val="18"/>
-        </w:rPr>
-        <w:t xml:space="preserve"> | Real Estate Support | Hospitality Operations</w:t>
+        <w:t>Administrative &amp; Operations Support | Client Relations | CRM Data Entry | Tourism &amp; Real Estate</w:t>
       </w:r>
     </w:p>
     <w:p>

</xml_diff>

<commit_message>
CVs: 5 competencies with gold titles, CRM added, 1-page. Portfolio: gold core skills titles.
</commit_message>
<xml_diff>
--- a/media/CV_Greivin_Cordero_Solano_EN.docx
+++ b/media/CV_Greivin_Cordero_Solano_EN.docx
@@ -31,7 +31,14 @@
           <w:color w:val="B8953D"/>
           <w:sz w:val="18"/>
         </w:rPr>
-        <w:t>Administrative &amp; Operations Support | Client Relations | CRM Data Entry | Tourism &amp; Real Estate</w:t>
+        <w:t>Administrative &amp; Operations Support</w:t>
+      </w:r>
+      <w:r>
+        <w:rPr>
+          <w:i/>
+          <w:sz w:val="18"/>
+        </w:rPr>
+        <w:t xml:space="preserve"> | Client Relations | CRM Data Entry | Tourism &amp; Real Estate</w:t>
       </w:r>
     </w:p>
     <w:p>
@@ -116,7 +123,7 @@
           <w:sz w:val="17"/>
           <w:szCs w:val="17"/>
         </w:rPr>
-        <w:t>Bilingual Administrative and Customer Service Professional with experience in real estate operations, hospitality, and international remote support. Skilled in asynchronous communication, digital organization, and independent task management. Background in client records, data entry, bilingual inquiries, and sales support. Pursuing a Bachelor's in Sustainable Tourism Management at UNED. Learning data analysis and intermediate Excel.</w:t>
+        <w:t>Bilingual Administrative and Customer Service Professional with experience in real estate operations, hospitality, and remote support. Skilled in asynchronous communication, digital organization, and independent task management. Background in client records, data entry, bilingual inquiries, and sales support. Pursuing a Bachelor's in Sustainable Tourism Management at UNED. Learning data analysis and Excel.</w:t>
       </w:r>
     </w:p>
     <w:p>
@@ -145,11 +152,11 @@
         <w:rPr>
           <w:b/>
           <w:bCs/>
-          <w:color w:val="1F3A5F"/>
-          <w:sz w:val="16"/>
-          <w:szCs w:val="16"/>
-        </w:rPr>
-        <w:t>Administrative Operations: Data entry, digital document organization, email management, and cross-timezone communication.</w:t>
+          <w:color w:val="B8953D"/>
+          <w:sz w:val="16"/>
+          <w:szCs w:val="16"/>
+        </w:rPr>
+        <w:t>Administrative Operations: Data entry, document organization, email management, and cross-timezone communication.</w:t>
       </w:r>
     </w:p>
     <w:p>
@@ -160,11 +167,11 @@
         <w:rPr>
           <w:b/>
           <w:bCs/>
-          <w:color w:val="1F3A5F"/>
-          <w:sz w:val="16"/>
-          <w:szCs w:val="16"/>
-        </w:rPr>
-        <w:t>Customer Service: Bilingual support (English/Spanish), answering client inquiries, and resolving daily operational issues.</w:t>
+          <w:color w:val="B8953D"/>
+          <w:sz w:val="16"/>
+          <w:szCs w:val="16"/>
+        </w:rPr>
+        <w:t>Customer Service: Bilingual support (EN/ES), answering client inquiries, and resolving daily operational issues.</w:t>
       </w:r>
     </w:p>
     <w:p>
@@ -175,11 +182,11 @@
         <w:rPr>
           <w:b/>
           <w:bCs/>
-          <w:color w:val="1F3A5F"/>
-          <w:sz w:val="16"/>
-          <w:szCs w:val="16"/>
-        </w:rPr>
-        <w:t>Real Estate Support: Updating property databases, assisting with daily office tasks, and supporting sales workflow.</w:t>
+          <w:color w:val="B8953D"/>
+          <w:sz w:val="16"/>
+          <w:szCs w:val="16"/>
+        </w:rPr>
+        <w:t>Real Estate Support: Updating property databases, CRM management, daily office tasks, and supporting sales workflow.</w:t>
       </w:r>
     </w:p>
     <w:p>
@@ -190,11 +197,21 @@
         <w:rPr>
           <w:b/>
           <w:bCs/>
-          <w:color w:val="1F3A5F"/>
-          <w:sz w:val="16"/>
-          <w:szCs w:val="16"/>
-        </w:rPr>
-        <w:t>Hospitality Operations: High-volume customer service, order management, and excellent guest experiences in dynamic environments.</w:t>
+          <w:color w:val="B8953D"/>
+          <w:sz w:val="16"/>
+          <w:szCs w:val="16"/>
+        </w:rPr>
+        <w:t>Hospitality Operations: High-volume service, order management, and excellent guest experiences in dynamic environments.</w:t>
+      </w:r>
+    </w:p>
+    <w:p>
+      <w:r>
+        <w:rPr>
+          <w:b/>
+          <w:color w:val="B8953D"/>
+          <w:sz w:val="16"/>
+        </w:rPr>
+        <w:t>Autonomous Work &amp; Learning: Proven ability to work independently, manage time effectively, and actively learn new tools like Excel and data analysis.</w:t>
       </w:r>
     </w:p>
     <w:p>
@@ -225,10 +242,14 @@
       <w:r>
         <w:rPr>
           <w:b/>
-          <w:color w:val="B8953D"/>
+          <w:bCs/>
+          <w:color w:val="1F3A5F"/>
           <w:sz w:val="17"/>
+          <w:szCs w:val="17"/>
         </w:rPr>
         <w:t>Hospitality Operations | Sales &amp; Customer Service Support | Digital Tools &amp; Marketing</w:t>
+        <w:tab/>
+        <w:t>Feb 2026 – Present</w:t>
       </w:r>
     </w:p>
     <w:p>

</xml_diff>

<commit_message>
CVs final: 1-page both, gold titles + gold links, 5 competencies EN, 4 ES, CRM added
</commit_message>
<xml_diff>
--- a/media/CV_Greivin_Cordero_Solano_EN.docx
+++ b/media/CV_Greivin_Cordero_Solano_EN.docx
@@ -28,17 +28,12 @@
       <w:r>
         <w:rPr>
           <w:i/>
+          <w:iCs/>
           <w:color w:val="B8953D"/>
           <w:sz w:val="18"/>
-        </w:rPr>
-        <w:t>Administrative &amp; Operations Support</w:t>
-      </w:r>
-      <w:r>
-        <w:rPr>
-          <w:i/>
-          <w:sz w:val="18"/>
-        </w:rPr>
-        <w:t xml:space="preserve"> | Client Relations | CRM Data Entry | Tourism &amp; Real Estate</w:t>
+          <w:szCs w:val="18"/>
+        </w:rPr>
+        <w:t>Administrative &amp; Operations Support | Client Relations | CRM Data Entry | Tourism &amp; Real Estate</w:t>
       </w:r>
     </w:p>
     <w:p>
@@ -156,7 +151,22 @@
           <w:sz w:val="16"/>
           <w:szCs w:val="16"/>
         </w:rPr>
-        <w:t>Administrative Operations: Data entry, document organization, email management, and cross-timezone communication.</w:t>
+        <w:t>Administrati</w:t>
+      </w:r>
+      <w:r>
+        <w:rPr>
+          <w:color w:val="B8953D"/>
+          <w:sz w:val="16"/>
+          <w:szCs w:val="16"/>
+        </w:rPr>
+        <w:t>ve Operations:</w:t>
+      </w:r>
+      <w:r>
+        <w:rPr>
+          <w:sz w:val="16"/>
+          <w:szCs w:val="16"/>
+        </w:rPr>
+        <w:t xml:space="preserve"> Data entry, document organization, email management, and cross-timezone communication.</w:t>
       </w:r>
     </w:p>
     <w:p>
@@ -171,7 +181,24 @@
           <w:sz w:val="16"/>
           <w:szCs w:val="16"/>
         </w:rPr>
-        <w:t>Customer Service: Bilingual support (EN/ES), answering client inquiries, and resolving daily operational issues.</w:t>
+        <w:t>Customer Service:</w:t>
+      </w:r>
+      <w:r>
+        <w:rPr>
+          <w:b/>
+          <w:bCs/>
+          <w:color w:val="1F3A5F"/>
+          <w:sz w:val="16"/>
+          <w:szCs w:val="16"/>
+        </w:rPr>
+        <w:t xml:space="preserve"> </w:t>
+      </w:r>
+      <w:r>
+        <w:rPr>
+          <w:sz w:val="16"/>
+          <w:szCs w:val="16"/>
+        </w:rPr>
+        <w:t>Bilingual support (EN/ES), answering client inquiries, and resolving daily operational issues.</w:t>
       </w:r>
     </w:p>
     <w:p>
@@ -186,7 +213,22 @@
           <w:sz w:val="16"/>
           <w:szCs w:val="16"/>
         </w:rPr>
-        <w:t>Real Estate Support: Updating property databases, CRM management, daily office tasks, and supporting sales workflow.</w:t>
+        <w:t>Real Estate &amp;</w:t>
+      </w:r>
+      <w:r>
+        <w:rPr>
+          <w:color w:val="B8953D"/>
+          <w:sz w:val="16"/>
+          <w:szCs w:val="16"/>
+        </w:rPr>
+        <w:t xml:space="preserve"> CRM Support:</w:t>
+      </w:r>
+      <w:r>
+        <w:rPr>
+          <w:sz w:val="16"/>
+          <w:szCs w:val="16"/>
+        </w:rPr>
+        <w:t xml:space="preserve"> Updating property databases, CRM management, daily office tasks, and supporting sales workflow.</w:t>
       </w:r>
     </w:p>
     <w:p>
@@ -201,17 +243,40 @@
           <w:sz w:val="16"/>
           <w:szCs w:val="16"/>
         </w:rPr>
-        <w:t>Hospitality Operations: High-volume service, order management, and excellent guest experiences in dynamic environments.</w:t>
-      </w:r>
-    </w:p>
-    <w:p>
-      <w:r>
-        <w:rPr>
-          <w:b/>
+        <w:t>Hospitali</w:t>
+      </w:r>
+      <w:r>
+        <w:rPr>
           <w:color w:val="B8953D"/>
           <w:sz w:val="16"/>
-        </w:rPr>
-        <w:t>Autonomous Work &amp; Learning: Proven ability to work independently, manage time effectively, and actively learn new tools like Excel and data analysis.</w:t>
+          <w:szCs w:val="16"/>
+        </w:rPr>
+        <w:t>ty Operations:</w:t>
+      </w:r>
+      <w:r>
+        <w:rPr>
+          <w:sz w:val="16"/>
+          <w:szCs w:val="16"/>
+        </w:rPr>
+        <w:t xml:space="preserve"> High-volume service, order management, and excellent guest experiences in dynamic environments.</w:t>
+      </w:r>
+    </w:p>
+    <w:p>
+      <w:r>
+        <w:rPr>
+          <w:b/>
+          <w:color w:val="B8953D"/>
+          <w:sz w:val="16"/>
+        </w:rPr>
+        <w:t>Autonomous Work &amp; Learning:</w:t>
+      </w:r>
+      <w:r>
+        <w:rPr>
+          <w:b w:val="0"/>
+          <w:color w:val="000000"/>
+          <w:sz w:val="16"/>
+        </w:rPr>
+        <w:t xml:space="preserve"> Proven ability to work independently, manage time effectively, and actively learn new tools like Excel and data analysis.</w:t>
       </w:r>
     </w:p>
     <w:p>
@@ -248,6 +313,15 @@
           <w:szCs w:val="17"/>
         </w:rPr>
         <w:t>Hospitality Operations | Sales &amp; Customer Service Support | Digital Tools &amp; Marketing</w:t>
+      </w:r>
+      <w:r>
+        <w:rPr>
+          <w:b/>
+          <w:bCs/>
+          <w:color w:val="C9A85B"/>
+          <w:sz w:val="15"/>
+          <w:szCs w:val="15"/>
+        </w:rPr>
         <w:tab/>
         <w:t>Feb 2026 – Present</w:t>
       </w:r>
@@ -417,8 +491,16 @@
           <w:szCs w:val="17"/>
         </w:rPr>
         <w:t>Service Operations &amp; Guest Experience</w:t>
-        <w:tab/>
-        <w:t>Aug 2021 – Nov 2025 · 4 yrs 4 months</w:t>
+      </w:r>
+      <w:r>
+        <w:rPr>
+          <w:b/>
+          <w:bCs/>
+          <w:color w:val="C9A85B"/>
+          <w:sz w:val="15"/>
+          <w:szCs w:val="15"/>
+        </w:rPr>
+        <w:t xml:space="preserve">	Aug 2021 – Nov 2025 · 4 yrs 4 months</w:t>
       </w:r>
     </w:p>
     <w:p>
@@ -560,8 +642,16 @@
           <w:szCs w:val="17"/>
         </w:rPr>
         <w:t>Administrative Assistant &amp; International Customer Service Specialist</w:t>
-        <w:tab/>
-        <w:t>Jan 2014 – Apr 2017 · 3 yrs 4 months</w:t>
+      </w:r>
+      <w:r>
+        <w:rPr>
+          <w:b/>
+          <w:bCs/>
+          <w:color w:val="C9A85B"/>
+          <w:sz w:val="15"/>
+          <w:szCs w:val="15"/>
+        </w:rPr>
+        <w:t xml:space="preserve">	Jan 2014 – Apr 2017 · 3 yrs 4 months</w:t>
       </w:r>
     </w:p>
     <w:p>

</xml_diff>